<commit_message>
Update docs to version 1.1
</commit_message>
<xml_diff>
--- a/Standard Capital - Form of Series A A&R Certificate of Incorporation.docx
+++ b/Standard Capital - Form of Series A A&R Certificate of Incorporation.docx
@@ -1958,7 +1958,7 @@
           <w:szCs w:val="22"/>
           <w:lang w:val="en-US" w:eastAsia="en-US"/>
         </w:rPr>
-        <w:t xml:space="preserve">, with respect to the </w:t>
+        <w:t xml:space="preserve">, with respect to </w:t>
       </w:r>
       <w:r>
         <w:rPr>
@@ -2343,7 +2343,6 @@
         <w:rPr>
           <w:u w:val="single"/>
         </w:rPr>
-        <w:lastRenderedPageBreak/>
         <w:t>Payments to Holders of Common Stock</w:t>
       </w:r>
       <w:r>
@@ -2470,25 +2469,22 @@
       </w:r>
       <w:bookmarkStart w:id="51" w:name="_DV_M109"/>
       <w:bookmarkEnd w:id="51"/>
+      <w:proofErr w:type="gramStart"/>
       <w:r>
         <w:t xml:space="preserve">a majority </w:t>
       </w:r>
       <w:r>
-        <w:t>of the outstanding shares of Preferred Stock</w:t>
+        <w:t>of</w:t>
+      </w:r>
+      <w:proofErr w:type="gramEnd"/>
+      <w:r>
+        <w:t xml:space="preserve"> the outstanding shares of Preferred Stock</w:t>
       </w:r>
       <w:r>
         <w:t>,</w:t>
       </w:r>
       <w:r>
-        <w:t xml:space="preserve"> voting together as a single class on an </w:t>
-      </w:r>
-      <w:proofErr w:type="gramStart"/>
-      <w:r>
-        <w:t>as-converted</w:t>
-      </w:r>
-      <w:proofErr w:type="gramEnd"/>
-      <w:r>
-        <w:t xml:space="preserve"> to Common Stock basis (the “</w:t>
+        <w:t xml:space="preserve"> voting together as a single class on an as-converted to Common Stock basis (the “</w:t>
       </w:r>
       <w:r>
         <w:rPr>
@@ -2582,15 +2578,7 @@
       <w:bookmarkStart w:id="61" w:name="_Ref175118432"/>
       <w:bookmarkEnd w:id="59"/>
       <w:r>
-        <w:t xml:space="preserve">a subsidiary of the Corporation is a constituent </w:t>
-      </w:r>
-      <w:proofErr w:type="gramStart"/>
-      <w:r>
-        <w:t>party</w:t>
-      </w:r>
-      <w:proofErr w:type="gramEnd"/>
-      <w:r>
-        <w:t xml:space="preserve"> and the Corporation issues shares of its capital stock pursuant to such merger</w:t>
+        <w:t>a subsidiary of the Corporation is a constituent party and the Corporation issues shares of its capital stock pursuant to such merger</w:t>
       </w:r>
       <w:r>
         <w:t>,</w:t>
@@ -2855,7 +2843,6 @@
       <w:bookmarkStart w:id="68" w:name="_Ref264025488"/>
       <w:bookmarkEnd w:id="67"/>
       <w:r>
-        <w:lastRenderedPageBreak/>
         <w:t>The Corporation shall not have the power to effect a Deemed Liquidation Event referred to in</w:t>
       </w:r>
       <w:r>
@@ -3408,14 +3395,9 @@
       </w:pPr>
       <w:bookmarkStart w:id="73" w:name="_Ref77806194"/>
       <w:r>
-        <w:t xml:space="preserve">the number of shares of Preferred Stock held by the holder that the Corporation shall redeem on the date specified in the Redemption </w:t>
-      </w:r>
-      <w:proofErr w:type="gramStart"/>
-      <w:r>
-        <w:t>Notice;</w:t>
+        <w:t>the number of shares of Preferred Stock held by the holder that the Corporation shall redeem on the date specified in the Redemption Notice;</w:t>
       </w:r>
       <w:bookmarkEnd w:id="73"/>
-      <w:proofErr w:type="gramEnd"/>
     </w:p>
     <w:p>
       <w:pPr>
@@ -3423,14 +3405,9 @@
       </w:pPr>
       <w:bookmarkStart w:id="74" w:name="_Ref77806195"/>
       <w:r>
-        <w:t xml:space="preserve">the redemption date and the price per share at which the shares of Preferred Stock are being </w:t>
-      </w:r>
-      <w:proofErr w:type="gramStart"/>
-      <w:r>
-        <w:t>redeemed;</w:t>
+        <w:t>the redemption date and the price per share at which the shares of Preferred Stock are being redeemed;</w:t>
       </w:r>
       <w:bookmarkEnd w:id="74"/>
-      <w:proofErr w:type="gramEnd"/>
     </w:p>
     <w:p>
       <w:pPr>
@@ -3438,11 +3415,7 @@
       </w:pPr>
       <w:bookmarkStart w:id="75" w:name="_Ref77806196"/>
       <w:r>
-        <w:t xml:space="preserve">for holders of shares in certificated form, that the holder is to surrender to the Corporation, in the manner and at the place designated, his, her or its certificate or certificates representing the shares </w:t>
-      </w:r>
-      <w:r>
-        <w:lastRenderedPageBreak/>
-        <w:t>of Preferred Stock to be redeemed.</w:t>
+        <w:t>for holders of shares in certificated form, that the holder is to surrender to the Corporation, in the manner and at the place designated, his, her or its certificate or certificates representing the shares of Preferred Stock to be redeemed.</w:t>
       </w:r>
       <w:bookmarkEnd w:id="75"/>
     </w:p>
@@ -4132,21 +4105,7 @@
         <w:rPr>
           <w:szCs w:val="22"/>
         </w:rPr>
-        <w:t xml:space="preserve"> as a single class and on an </w:t>
-      </w:r>
-      <w:proofErr w:type="gramStart"/>
-      <w:r>
-        <w:rPr>
-          <w:szCs w:val="22"/>
-        </w:rPr>
-        <w:t>as-converted</w:t>
-      </w:r>
-      <w:proofErr w:type="gramEnd"/>
-      <w:r>
-        <w:rPr>
-          <w:szCs w:val="22"/>
-        </w:rPr>
-        <w:t xml:space="preserve"> to Common Stock basis.</w:t>
+        <w:t xml:space="preserve"> as a single class and on an as-converted to Common Stock basis.</w:t>
       </w:r>
     </w:p>
     <w:p>
@@ -4253,11 +4212,7 @@
       </w:r>
       <w:proofErr w:type="spellEnd"/>
       <w:r>
-        <w:t xml:space="preserve"> any of the following acts or transactions without (in addition to any other vote required </w:t>
-      </w:r>
-      <w:r>
-        <w:lastRenderedPageBreak/>
-        <w:t>by law or this Certificate of Incorporation) the written consent or affirmative vote of the Requisite Holders,</w:t>
+        <w:t xml:space="preserve"> any of the following acts or transactions without (in addition to any other vote required by law or this Certificate of Incorporation) the written consent or affirmative vote of the Requisite Holders,</w:t>
       </w:r>
       <w:bookmarkStart w:id="105" w:name="_DV_M155"/>
       <w:bookmarkEnd w:id="105"/>
@@ -4320,11 +4275,7 @@
         <w:t xml:space="preserve"> effect any</w:t>
       </w:r>
       <w:r>
-        <w:t xml:space="preserve"> Deemed Liquidation </w:t>
-      </w:r>
-      <w:proofErr w:type="gramStart"/>
-      <w:r>
-        <w:t>Event</w:t>
+        <w:t xml:space="preserve"> Deemed Liquidation Event</w:t>
       </w:r>
       <w:bookmarkStart w:id="107" w:name="_DV_M156"/>
       <w:bookmarkEnd w:id="107"/>
@@ -4334,7 +4285,6 @@
       <w:bookmarkStart w:id="108" w:name="_DV_M157"/>
       <w:bookmarkEnd w:id="106"/>
       <w:bookmarkEnd w:id="108"/>
-      <w:proofErr w:type="gramEnd"/>
     </w:p>
     <w:p>
       <w:pPr>
@@ -4359,16 +4309,11 @@
         <w:t xml:space="preserve"> Preferred Stock </w:t>
       </w:r>
       <w:r>
-        <w:t>(or any series thereof</w:t>
-      </w:r>
-      <w:proofErr w:type="gramStart"/>
-      <w:r>
-        <w:t>)</w:t>
+        <w:t>(or any series thereof)</w:t>
       </w:r>
       <w:r>
         <w:t>;</w:t>
       </w:r>
-      <w:proofErr w:type="gramEnd"/>
     </w:p>
     <w:p>
       <w:pPr>
@@ -4412,18 +4357,9 @@
           <w:rFonts w:ascii="TimesNewRomanPSMT" w:hAnsi="TimesNewRomanPSMT"/>
           <w:color w:val="000000"/>
         </w:rPr>
-        <w:t xml:space="preserve"> unless the same ranks junior to the Preferred Stock with respect to its special rights, powers and </w:t>
-      </w:r>
-      <w:proofErr w:type="gramStart"/>
-      <w:r>
-        <w:rPr>
-          <w:rFonts w:ascii="TimesNewRomanPSMT" w:hAnsi="TimesNewRomanPSMT"/>
-          <w:color w:val="000000"/>
-        </w:rPr>
-        <w:t>preferences;</w:t>
+        <w:t xml:space="preserve"> unless the same ranks junior to the Preferred Stock with respect to its special rights, powers and preferences;</w:t>
       </w:r>
       <w:bookmarkEnd w:id="109"/>
-      <w:proofErr w:type="gramEnd"/>
     </w:p>
     <w:bookmarkEnd w:id="110"/>
     <w:p>
@@ -4431,16 +4367,11 @@
         <w:pStyle w:val="Heading6"/>
       </w:pPr>
       <w:r>
-        <w:t xml:space="preserve">adopt, amend, terminate or repeal any equity (or equity-linked) compensation </w:t>
-      </w:r>
-      <w:proofErr w:type="gramStart"/>
-      <w:r>
-        <w:t>plan</w:t>
+        <w:t>adopt, amend, terminate or repeal any equity (or equity-linked) compensation plan</w:t>
       </w:r>
       <w:r>
         <w:t>;</w:t>
       </w:r>
-      <w:proofErr w:type="gramEnd"/>
     </w:p>
     <w:p>
       <w:pPr>
@@ -4457,13 +4388,8 @@
         <w:t>Tokens</w:t>
       </w:r>
       <w:r>
-        <w:t xml:space="preserve">”), including through a pre-sale, initial coin offering, token distribution event or crowdfunding, or through the issuance of any instrument convertible into or exchangeable for </w:t>
-      </w:r>
-      <w:proofErr w:type="gramStart"/>
-      <w:r>
-        <w:t>Tokens;</w:t>
-      </w:r>
-      <w:proofErr w:type="gramEnd"/>
+        <w:t>”), including through a pre-sale, initial coin offering, token distribution event or crowdfunding, or through the issuance of any instrument convertible into or exchangeable for Tokens;</w:t>
+      </w:r>
     </w:p>
     <w:p>
       <w:pPr>
@@ -4587,7 +4513,6 @@
           <w:szCs w:val="22"/>
           <w:u w:val="single"/>
         </w:rPr>
-        <w:lastRenderedPageBreak/>
         <w:t>Right to Convert</w:t>
       </w:r>
       <w:r>
@@ -5221,7 +5146,21 @@
         <w:rPr>
           <w:szCs w:val="22"/>
         </w:rPr>
-        <w:t xml:space="preserve"> For the avoidance of doubt, no fractional interests in shares of Common Stock shall be created or issuable as a result of the conversion of the Preferred Stock pursuant to </w:t>
+        <w:t xml:space="preserve"> For the avoidance of doubt, no fractional interests in shares of Common Stock shall be created or issuable </w:t>
+      </w:r>
+      <w:proofErr w:type="gramStart"/>
+      <w:r>
+        <w:rPr>
+          <w:szCs w:val="22"/>
+        </w:rPr>
+        <w:t>as a result of</w:t>
+      </w:r>
+      <w:proofErr w:type="gramEnd"/>
+      <w:r>
+        <w:rPr>
+          <w:szCs w:val="22"/>
+        </w:rPr>
+        <w:t xml:space="preserve"> the conversion of the Preferred Stock pursuant to </w:t>
       </w:r>
       <w:r>
         <w:rPr>
@@ -5380,11 +5319,7 @@
         <w:t xml:space="preserve"> </w:t>
       </w:r>
       <w:r>
-        <w:t xml:space="preserve">If required by the Corporation, any certificates surrendered for conversion shall be endorsed or accompanied by a written instrument or instruments of transfer, in form satisfactory to the Corporation, duly executed by the registered holder or his, her or its attorney duly </w:t>
-      </w:r>
-      <w:r>
-        <w:lastRenderedPageBreak/>
-        <w:t>authorized in writing.</w:t>
+        <w:t>If required by the Corporation, any certificates surrendered for conversion shall be endorsed or accompanied by a written instrument or instruments of transfer, in form satisfactory to the Corporation, duly executed by the registered holder or his, her or its attorney duly authorized in writing.</w:t>
       </w:r>
       <w:r>
         <w:t xml:space="preserve"> </w:t>
@@ -5735,7 +5670,6 @@
       <w:bookmarkEnd w:id="145"/>
       <w:bookmarkEnd w:id="146"/>
       <w:r>
-        <w:lastRenderedPageBreak/>
         <w:t>“</w:t>
       </w:r>
       <w:r>
@@ -5837,14 +5771,12 @@
       <w:r>
         <w:t>other classes or series of stock</w:t>
       </w:r>
-      <w:proofErr w:type="gramStart"/>
       <w:r>
         <w:t>)</w:t>
       </w:r>
       <w:r>
         <w:t>;</w:t>
       </w:r>
-      <w:proofErr w:type="gramEnd"/>
     </w:p>
     <w:p>
       <w:pPr>
@@ -6045,16 +5977,11 @@
       <w:bookmarkStart w:id="150" w:name="_DV_M192"/>
       <w:bookmarkEnd w:id="150"/>
       <w:r>
-        <w:t xml:space="preserve">shares of Common Stock, Options or Convertible Securities issued to banks, equipment lessors or other financial institutions, or to real property lessors, pursuant to a debt financing, equipment leasing or real property leasing </w:t>
-      </w:r>
-      <w:proofErr w:type="gramStart"/>
-      <w:r>
-        <w:t>transaction</w:t>
+        <w:t>shares of Common Stock, Options or Convertible Securities issued to banks, equipment lessors or other financial institutions, or to real property lessors, pursuant to a debt financing, equipment leasing or real property leasing transaction</w:t>
       </w:r>
       <w:r>
         <w:t>;</w:t>
       </w:r>
-      <w:proofErr w:type="gramEnd"/>
     </w:p>
     <w:p>
       <w:pPr>
@@ -6067,18 +5994,10 @@
         <w:t xml:space="preserve">approved </w:t>
       </w:r>
       <w:r>
-        <w:t xml:space="preserve">by the Board of </w:t>
-      </w:r>
-      <w:proofErr w:type="gramStart"/>
-      <w:r>
-        <w:t>Directors</w:t>
-      </w:r>
-      <w:r>
-        <w:t>;</w:t>
-      </w:r>
-      <w:proofErr w:type="gramEnd"/>
-      <w:r>
-        <w:t xml:space="preserve"> </w:t>
+        <w:t>by the Board of Directors</w:t>
+      </w:r>
+      <w:r>
+        <w:t xml:space="preserve">; </w:t>
       </w:r>
     </w:p>
     <w:p>
@@ -6130,7 +6049,7 @@
         <w:t xml:space="preserve">shares of Common Stock issued in connection with a </w:t>
       </w:r>
       <w:r>
-        <w:t xml:space="preserve">firmly underwritten public offering of </w:t>
+        <w:t xml:space="preserve">firm underwritten public offering of </w:t>
       </w:r>
       <w:r>
         <w:t>the Corporation</w:t>
@@ -6166,15 +6085,7 @@
         <w:t>s</w:t>
       </w:r>
       <w:r>
-        <w:t xml:space="preserve"> any </w:t>
-      </w:r>
-      <w:proofErr w:type="gramStart"/>
-      <w:r>
-        <w:t>evidences</w:t>
-      </w:r>
-      <w:proofErr w:type="gramEnd"/>
-      <w:r>
-        <w:t xml:space="preserve"> of indebtedness, shares or other securities directly or indirectly convertible into or exchangeable for Common Stock, but excluding Options.</w:t>
+        <w:t xml:space="preserve"> any evidences of indebtedness, shares or other securities directly or indirectly convertible into or exchangeable for Common Stock, but excluding Options.</w:t>
       </w:r>
     </w:p>
     <w:p>
@@ -6209,7 +6120,6 @@
       <w:bookmarkStart w:id="154" w:name="_Ref264021330"/>
       <w:bookmarkEnd w:id="153"/>
       <w:r>
-        <w:lastRenderedPageBreak/>
         <w:t>“</w:t>
       </w:r>
       <w:r>
@@ -6604,11 +6514,7 @@
         <w:t xml:space="preserve"> </w:t>
       </w:r>
       <w:r>
-        <w:t xml:space="preserve">as a result of an amendment to such terms or </w:t>
-      </w:r>
-      <w:r>
-        <w:lastRenderedPageBreak/>
-        <w:t>any other adjustment pursuant to the provisions of such Option or Convertible Security (but excluding automatic adjustments to such terms pursuant to anti-dilution or similar provisions of such Option or Convertible Security)</w:t>
+        <w:t>as a result of an amendment to such terms or any other adjustment pursuant to the provisions of such Option or Convertible Security (but excluding automatic adjustments to such terms pursuant to anti-dilution or similar provisions of such Option or Convertible Security)</w:t>
       </w:r>
       <w:bookmarkStart w:id="165" w:name="_DV_M205"/>
       <w:bookmarkEnd w:id="165"/>
@@ -7232,7 +7138,6 @@
       <w:bookmarkStart w:id="176" w:name="_DV_M218"/>
       <w:bookmarkEnd w:id="176"/>
       <w:r>
-        <w:lastRenderedPageBreak/>
         <w:t>“CP</w:t>
       </w:r>
       <w:r>
@@ -7242,16 +7147,11 @@
         <w:t>2</w:t>
       </w:r>
       <w:r>
-        <w:t xml:space="preserve">” shall mean the Conversion Price of such series of Preferred Stock in effect immediately after such issuance or deemed issuance of Additional Shares of Common </w:t>
-      </w:r>
-      <w:proofErr w:type="gramStart"/>
-      <w:r>
-        <w:t>Stock</w:t>
+        <w:t>” shall mean the Conversion Price of such series of Preferred Stock in effect immediately after such issuance or deemed issuance of Additional Shares of Common Stock</w:t>
       </w:r>
       <w:r>
         <w:t>;</w:t>
       </w:r>
-      <w:proofErr w:type="gramEnd"/>
     </w:p>
     <w:p>
       <w:pPr>
@@ -7269,15 +7169,7 @@
         <w:t>1</w:t>
       </w:r>
       <w:r>
-        <w:t xml:space="preserve">” shall mean the Conversion Price of such series of Preferred Stock in effect immediately prior to such issuance or deemed issuance of Additional Shares of Common </w:t>
-      </w:r>
-      <w:proofErr w:type="gramStart"/>
-      <w:r>
-        <w:t>Stock;</w:t>
-      </w:r>
-      <w:proofErr w:type="gramEnd"/>
-      <w:r>
-        <w:t xml:space="preserve"> </w:t>
+        <w:t xml:space="preserve">” shall mean the Conversion Price of such series of Preferred Stock in effect immediately prior to such issuance or deemed issuance of Additional Shares of Common Stock; </w:t>
       </w:r>
     </w:p>
     <w:p>
@@ -7428,14 +7320,9 @@
       </w:pPr>
       <w:bookmarkStart w:id="186" w:name="_Ref145515190"/>
       <w:r>
-        <w:t xml:space="preserve">insofar as it consists of cash, be computed at the aggregate amount of cash received by the Corporation, excluding amounts paid or payable for accrued </w:t>
-      </w:r>
-      <w:proofErr w:type="gramStart"/>
-      <w:r>
-        <w:t>interest;</w:t>
+        <w:t>insofar as it consists of cash, be computed at the aggregate amount of cash received by the Corporation, excluding amounts paid or payable for accrued interest;</w:t>
       </w:r>
       <w:bookmarkEnd w:id="186"/>
-      <w:proofErr w:type="gramEnd"/>
     </w:p>
     <w:p>
       <w:pPr>
@@ -7595,7 +7482,6 @@
       <w:bookmarkStart w:id="190" w:name="_DV_M231"/>
       <w:bookmarkEnd w:id="190"/>
       <w:r>
-        <w:lastRenderedPageBreak/>
         <w:t xml:space="preserve">The total amount, if any, received or receivable by the Corporation as consideration for the issue of such Options or Convertible Securities, plus the minimum aggregate amount of additional consideration (as set forth in the instruments relating thereto, without regard to any provision contained therein for a subsequent adjustment of such consideration) payable to the Corporation upon the exercise of such Options or the conversion or exchange of such Convertible Securities, or in the case of Options for Convertible Securities, the exercise of such Options for Convertible Securities and the conversion or exchange of such Convertible Securities, by </w:t>
       </w:r>
     </w:p>
@@ -7864,7 +7750,6 @@
           <w:szCs w:val="22"/>
           <w:u w:val="single"/>
         </w:rPr>
-        <w:lastRenderedPageBreak/>
         <w:t>Adjustment for Certain Dividends and Distributions</w:t>
       </w:r>
       <w:r>
@@ -8421,14 +8306,7 @@
         <w:rPr>
           <w:szCs w:val="22"/>
         </w:rPr>
-        <w:t xml:space="preserve">with respect to the rights and interests thereafter </w:t>
-      </w:r>
-      <w:r>
-        <w:rPr>
-          <w:szCs w:val="22"/>
-        </w:rPr>
-        <w:lastRenderedPageBreak/>
-        <w:t xml:space="preserve">of the holders of the Preferred Stock, to the end that the provisions set forth in this </w:t>
+        <w:t xml:space="preserve">with respect to the rights and interests thereafter of the holders of the Preferred Stock, to the end that the provisions set forth in this </w:t>
       </w:r>
       <w:r>
         <w:rPr>
@@ -8882,7 +8760,6 @@
         <w:pStyle w:val="Heading7"/>
       </w:pPr>
       <w:r>
-        <w:lastRenderedPageBreak/>
         <w:t>immediately prior to the</w:t>
       </w:r>
       <w:r>
@@ -9128,21 +9005,7 @@
         <w:rPr>
           <w:szCs w:val="22"/>
         </w:rPr>
-        <w:t xml:space="preserve">If </w:t>
-      </w:r>
-      <w:proofErr w:type="gramStart"/>
-      <w:r>
-        <w:rPr>
-          <w:szCs w:val="22"/>
-        </w:rPr>
-        <w:t>so</w:t>
-      </w:r>
-      <w:proofErr w:type="gramEnd"/>
-      <w:r>
-        <w:rPr>
-          <w:szCs w:val="22"/>
-        </w:rPr>
-        <w:t xml:space="preserve"> required by the Corporation, any certificates surrendered for conversion shall be endorsed or accompanied by written instrument or instruments of transfer, in form satisfactory to the Corporation, duly executed by the registered holder or by his, her or its attorney duly authorized in writing.</w:t>
+        <w:t>If so required by the Corporation, any certificates surrendered for conversion shall be endorsed or accompanied by written instrument or instruments of transfer, in form satisfactory to the Corporation, duly executed by the registered holder or by his, her or its attorney duly authorized in writing.</w:t>
       </w:r>
       <w:r>
         <w:rPr>
@@ -9429,11 +9292,7 @@
         <w:t xml:space="preserve"> </w:t>
       </w:r>
       <w:r>
-        <w:t xml:space="preserve">as otherwise set forth herein, (a) any of the rights, powers, preferences and other terms of the Preferred Stock set forth herein may be waived on behalf of all holders </w:t>
-      </w:r>
-      <w:r>
-        <w:lastRenderedPageBreak/>
-        <w:t xml:space="preserve">of Preferred Stock by the affirmative written consent or vote of the holders </w:t>
+        <w:t xml:space="preserve">as otherwise set forth herein, (a) any of the rights, powers, preferences and other terms of the Preferred Stock set forth herein may be waived on behalf of all holders of Preferred Stock by the affirmative written consent or vote of the holders </w:t>
       </w:r>
       <w:r>
         <w:t>that would otherwise be required to amend such right, powers, preferences, and other terms</w:t>
@@ -10124,7 +9983,6 @@
         <w:rPr>
           <w:szCs w:val="22"/>
         </w:rPr>
-        <w:lastRenderedPageBreak/>
         <w:t>Any amendment, repeal</w:t>
       </w:r>
       <w:r>
@@ -10885,14 +10743,7 @@
         <w:rPr>
           <w:szCs w:val="22"/>
         </w:rPr>
-        <w:t xml:space="preserve"> from employees, officers, directors or consultants of the Corporation in connection with a termination of employment or services pursuant to agreements or arrangements approved </w:t>
-      </w:r>
-      <w:r>
-        <w:rPr>
-          <w:szCs w:val="22"/>
-        </w:rPr>
-        <w:lastRenderedPageBreak/>
-        <w:t>by the Board of Directors (in addition to any other consent required under this Certificate of Incorporation), such repurchase may be made without regard to any “preferential dividends arrears amount” or “</w:t>
+        <w:t xml:space="preserve"> from employees, officers, directors or consultants of the Corporation in connection with a termination of employment or services pursuant to agreements or arrangements approved by the Board of Directors (in addition to any other consent required under this Certificate of Incorporation), such repurchase may be made without regard to any “preferential dividends arrears amount” or “</w:t>
       </w:r>
       <w:r>
         <w:rPr>
@@ -11059,7 +10910,6 @@
           <w:bCs/>
           <w:szCs w:val="22"/>
         </w:rPr>
-        <w:lastRenderedPageBreak/>
         <w:t>IN WITNESS WHEREOF</w:t>
       </w:r>
       <w:r>
@@ -11505,7 +11355,7 @@
             </wp:anchor>
           </w:drawing>
         </mc:Choice>
-        <mc:Fallback>
+        <mc:Fallback xmlns="">
           <w:pict>
             <v:shapetype w14:anchorId="1BD4DCFB" id="_x0000_t202" coordsize="21600,21600" o:spt="202" path="m,l,21600r21600,l21600,xe">
               <v:stroke joinstyle="miter"/>
@@ -11735,7 +11585,14 @@
         <w:i/>
         <w:iCs/>
       </w:rPr>
-      <w:t>Version 1.0</w:t>
+      <w:t>Version 1.</w:t>
+    </w:r>
+    <w:r>
+      <w:rPr>
+        <w:i/>
+        <w:iCs/>
+      </w:rPr>
+      <w:t>1</w:t>
     </w:r>
   </w:p>
   <w:p>
@@ -11829,23 +11686,7 @@
         <w:i/>
         <w:iCs/>
       </w:rPr>
-      <w:t xml:space="preserve">generally do not accept comments or revisions to the standardized provisions. We will consider modifications only in exceptional circumstances where there </w:t>
-    </w:r>
-    <w:proofErr w:type="gramStart"/>
-    <w:r>
-      <w:rPr>
-        <w:i/>
-        <w:iCs/>
-      </w:rPr>
-      <w:t>are</w:t>
-    </w:r>
-    <w:proofErr w:type="gramEnd"/>
-    <w:r>
-      <w:rPr>
-        <w:i/>
-        <w:iCs/>
-      </w:rPr>
-      <w:t xml:space="preserve"> compelling business, legal, or regulatory reasons that require deviation from our standard terms, and any requested changes must be accompanied by a detailed explanation of the specific rationale and business necessity.</w:t>
+      <w:t>generally do not accept comments or revisions to the standardized provisions. We will consider modifications only in exceptional circumstances where there are compelling business, legal, or regulatory reasons that require deviation from our standard terms, and any requested changes must be accompanied by a detailed explanation of the specific rationale and business necessity.</w:t>
     </w:r>
   </w:p>
 </w:hdr>
@@ -16980,12 +16821,6 @@
 </file>
 
 <file path=customXml/item1.xml><?xml version="1.0" encoding="utf-8"?>
-<p:properties xmlns:p="http://schemas.microsoft.com/office/2006/metadata/properties" xmlns:xsi="http://www.w3.org/2001/XMLSchema-instance" xmlns:pc="http://schemas.microsoft.com/office/infopath/2007/PartnerControls">
-  <documentManagement/>
-</p:properties>
-</file>
-
-<file path=customXml/item2.xml><?xml version="1.0" encoding="utf-8"?>
 <?mso-contentType ?>
 <FormTemplates xmlns="http://schemas.microsoft.com/sharepoint/v3/contenttype/forms">
   <Display>DocumentLibraryForm</Display>
@@ -16994,7 +16829,7 @@
 </FormTemplates>
 </file>
 
-<file path=customXml/item3.xml><?xml version="1.0" encoding="utf-8"?>
+<file path=customXml/item2.xml><?xml version="1.0" encoding="utf-8"?>
 <ct:contentTypeSchema xmlns:ct="http://schemas.microsoft.com/office/2006/metadata/contentType" xmlns:ma="http://schemas.microsoft.com/office/2006/metadata/properties/metaAttributes" ct:_="" ma:_="" ma:contentTypeName="Document" ma:contentTypeID="0x01010083CE1BD5A562CB4B82EC65E39C99AF6A" ma:contentTypeVersion="11" ma:contentTypeDescription="Create a new document." ma:contentTypeScope="" ma:versionID="cb4cf6da84fbfabb14d81d8a1d2589d5">
   <xsd:schema xmlns:xsd="http://www.w3.org/2001/XMLSchema" xmlns:xs="http://www.w3.org/2001/XMLSchema" xmlns:p="http://schemas.microsoft.com/office/2006/metadata/properties" xmlns:ns2="9c0a36f1-4d58-430e-8449-b0eaaf5fe206" xmlns:ns3="37e6111b-6a63-4681-b603-c7bc9a020fd3" targetNamespace="http://schemas.microsoft.com/office/2006/metadata/properties" ma:root="true" ma:fieldsID="4889f2b19c1c6d75d4b9f15cb4599486" ns2:_="" ns3:_="">
     <xsd:import namespace="9c0a36f1-4d58-430e-8449-b0eaaf5fe206"/>
@@ -17203,20 +17038,17 @@
 </ct:contentTypeSchema>
 </file>
 
-<file path=customXml/item4.xml><?xml version="1.0" encoding="utf-8"?>
+<file path=customXml/item3.xml><?xml version="1.0" encoding="utf-8"?>
 <b:Sources xmlns:b="http://schemas.openxmlformats.org/officeDocument/2006/bibliography" xmlns="http://schemas.openxmlformats.org/officeDocument/2006/bibliography" SelectedStyle="\APASixthEditionOfficeOnline.xsl" StyleName="APA" Version="6"/>
 </file>
 
-<file path=customXml/itemProps1.xml><?xml version="1.0" encoding="utf-8"?>
-<ds:datastoreItem xmlns:ds="http://schemas.openxmlformats.org/officeDocument/2006/customXml" ds:itemID="{6C5C28EC-05B9-4A6D-8848-76E4AFFA822C}">
-  <ds:schemaRefs>
-    <ds:schemaRef ds:uri="http://schemas.microsoft.com/office/2006/metadata/properties"/>
-    <ds:schemaRef ds:uri="http://schemas.microsoft.com/office/infopath/2007/PartnerControls"/>
-  </ds:schemaRefs>
-</ds:datastoreItem>
+<file path=customXml/item4.xml><?xml version="1.0" encoding="utf-8"?>
+<p:properties xmlns:p="http://schemas.microsoft.com/office/2006/metadata/properties" xmlns:xsi="http://www.w3.org/2001/XMLSchema-instance" xmlns:pc="http://schemas.microsoft.com/office/infopath/2007/PartnerControls">
+  <documentManagement/>
+</p:properties>
 </file>
 
-<file path=customXml/itemProps2.xml><?xml version="1.0" encoding="utf-8"?>
+<file path=customXml/itemProps1.xml><?xml version="1.0" encoding="utf-8"?>
 <ds:datastoreItem xmlns:ds="http://schemas.openxmlformats.org/officeDocument/2006/customXml" ds:itemID="{4672093B-9B5F-4BF0-8D5F-717A6578F578}">
   <ds:schemaRefs>
     <ds:schemaRef ds:uri="http://schemas.microsoft.com/sharepoint/v3/contenttype/forms"/>
@@ -17224,7 +17056,7 @@
 </ds:datastoreItem>
 </file>
 
-<file path=customXml/itemProps3.xml><?xml version="1.0" encoding="utf-8"?>
+<file path=customXml/itemProps2.xml><?xml version="1.0" encoding="utf-8"?>
 <ds:datastoreItem xmlns:ds="http://schemas.openxmlformats.org/officeDocument/2006/customXml" ds:itemID="{3A86B527-65CA-4C3B-8B0C-42430E4E07E0}">
   <ds:schemaRefs>
     <ds:schemaRef ds:uri="http://schemas.microsoft.com/office/2006/metadata/contentType"/>
@@ -17243,10 +17075,19 @@
 </ds:datastoreItem>
 </file>
 
-<file path=customXml/itemProps4.xml><?xml version="1.0" encoding="utf-8"?>
+<file path=customXml/itemProps3.xml><?xml version="1.0" encoding="utf-8"?>
 <ds:datastoreItem xmlns:ds="http://schemas.openxmlformats.org/officeDocument/2006/customXml" ds:itemID="{5C01CA1D-293A-437C-BDAE-94EAACC17152}">
   <ds:schemaRefs>
     <ds:schemaRef ds:uri="http://schemas.openxmlformats.org/officeDocument/2006/bibliography"/>
   </ds:schemaRefs>
 </ds:datastoreItem>
+</file>
+
+<file path=customXml/itemProps4.xml><?xml version="1.0" encoding="utf-8"?>
+<ds:datastoreItem xmlns:ds="http://schemas.openxmlformats.org/officeDocument/2006/customXml" ds:itemID="{6C5C28EC-05B9-4A6D-8848-76E4AFFA822C}">
+  <ds:schemaRefs>
+    <ds:schemaRef ds:uri="http://schemas.microsoft.com/office/2006/metadata/properties"/>
+    <ds:schemaRef ds:uri="http://schemas.microsoft.com/office/infopath/2007/PartnerControls"/>
+  </ds:schemaRefs>
+</ds:datastoreItem>
 </file>
</xml_diff>